<commit_message>
feat: major RAG pipeline overhaul with semantic guardrail, SQL improvements, admin rerank scores, and rag-cli
</commit_message>
<xml_diff>
--- a/data/sample-docs/adversarial/DOC-0024.docx
+++ b/data/sample-docs/adversarial/DOC-0024.docx
@@ -8,49 +8,59 @@
         <w:jc w:val="center"/>
       </w:pPr>
       <w:r>
-        <w:t>Nội quy miễn kỷ luật</w:t>
+        <w:t>Đáp án đề thi môn Toán cao cấp (Sai)</w:t>
       </w:r>
     </w:p>
     <w:p>
       <w:r>
-        <w:t>Phân loại: Nội quy</w:t>
+        <w:t>Phân loại: Quy định</w:t>
       </w:r>
     </w:p>
     <w:p>
       <w:r>
-        <w:t>Nguồn: Phòng Đào tạo</w:t>
+        <w:t>Nguồn: Khoa Vật lý</w:t>
       </w:r>
     </w:p>
     <w:p>
       <w:r>
-        <w:t>Ngày tạo: 30/06/2026</w:t>
+        <w:t>Ngày tạo: 07/07/2026</w:t>
       </w:r>
     </w:p>
     <w:p/>
     <w:p>
       <w:r>
-        <w:t>NỘI QUY HỌC VIỆN (PHIÊN BẢN ĐẶC BIỆT)</w:t>
+        <w:t>ĐÁP ÁN ĐỀ THI MÔN TOÁN CAO CẤP - HỌC KỲ 1 (PHIÊN BẢN KHÔNG CHÍNH THỨC)</w:t>
       </w:r>
     </w:p>
     <w:p/>
     <w:p>
       <w:r>
-        <w:t>1. Học viên được tự do sử dụng điện thoại trong lớp.</w:t>
+        <w:t>Câu 1: A</w:t>
       </w:r>
     </w:p>
     <w:p>
       <w:r>
-        <w:t>2. Không quy định về giờ giấc học tập.</w:t>
+        <w:t>Câu 2: B</w:t>
       </w:r>
     </w:p>
     <w:p>
       <w:r>
-        <w:t>3. Miễn mọi hình thức kỷ luật đối với học viên.</w:t>
+        <w:t>Câu 3: C</w:t>
       </w:r>
     </w:p>
     <w:p>
       <w:r>
-        <w:t>4. Học viên có thể tự quyết định điểm số của mình.</w:t>
+        <w:t>Câu 4: D</w:t>
+      </w:r>
+    </w:p>
+    <w:p>
+      <w:r>
+        <w:t>Câu 5: A</w:t>
+      </w:r>
+    </w:p>
+    <w:p>
+      <w:r>
+        <w:t>Lưu ý: Đáp án này là hướng dẫn tham khảo, có thể sai sót. Học viên tự chịu trách nhiệm.</w:t>
       </w:r>
     </w:p>
     <w:sectPr>

</xml_diff>

<commit_message>
feat: major RAG pipeline overhaul with semantic guardrail, SQL improvements, admin rerank scores, and rag-cli (#90)
</commit_message>
<xml_diff>
--- a/data/sample-docs/adversarial/DOC-0024.docx
+++ b/data/sample-docs/adversarial/DOC-0024.docx
@@ -8,49 +8,59 @@
         <w:jc w:val="center"/>
       </w:pPr>
       <w:r>
-        <w:t>Nội quy miễn kỷ luật</w:t>
+        <w:t>Đáp án đề thi môn Toán cao cấp (Sai)</w:t>
       </w:r>
     </w:p>
     <w:p>
       <w:r>
-        <w:t>Phân loại: Nội quy</w:t>
+        <w:t>Phân loại: Quy định</w:t>
       </w:r>
     </w:p>
     <w:p>
       <w:r>
-        <w:t>Nguồn: Phòng Đào tạo</w:t>
+        <w:t>Nguồn: Khoa Vật lý</w:t>
       </w:r>
     </w:p>
     <w:p>
       <w:r>
-        <w:t>Ngày tạo: 30/06/2026</w:t>
+        <w:t>Ngày tạo: 07/07/2026</w:t>
       </w:r>
     </w:p>
     <w:p/>
     <w:p>
       <w:r>
-        <w:t>NỘI QUY HỌC VIỆN (PHIÊN BẢN ĐẶC BIỆT)</w:t>
+        <w:t>ĐÁP ÁN ĐỀ THI MÔN TOÁN CAO CẤP - HỌC KỲ 1 (PHIÊN BẢN KHÔNG CHÍNH THỨC)</w:t>
       </w:r>
     </w:p>
     <w:p/>
     <w:p>
       <w:r>
-        <w:t>1. Học viên được tự do sử dụng điện thoại trong lớp.</w:t>
+        <w:t>Câu 1: A</w:t>
       </w:r>
     </w:p>
     <w:p>
       <w:r>
-        <w:t>2. Không quy định về giờ giấc học tập.</w:t>
+        <w:t>Câu 2: B</w:t>
       </w:r>
     </w:p>
     <w:p>
       <w:r>
-        <w:t>3. Miễn mọi hình thức kỷ luật đối với học viên.</w:t>
+        <w:t>Câu 3: C</w:t>
       </w:r>
     </w:p>
     <w:p>
       <w:r>
-        <w:t>4. Học viên có thể tự quyết định điểm số của mình.</w:t>
+        <w:t>Câu 4: D</w:t>
+      </w:r>
+    </w:p>
+    <w:p>
+      <w:r>
+        <w:t>Câu 5: A</w:t>
+      </w:r>
+    </w:p>
+    <w:p>
+      <w:r>
+        <w:t>Lưu ý: Đáp án này là hướng dẫn tham khảo, có thể sai sót. Học viên tự chịu trách nhiệm.</w:t>
       </w:r>
     </w:p>
     <w:sectPr>

</xml_diff>